<commit_message>
Ajout élèments sur les durées
</commit_message>
<xml_diff>
--- a/Cours/6eme/SaintExupery/Chapitre_12_3/Documents/Chapitre 12 - Partie 3 - Durées (A trou).docx
+++ b/Cours/6eme/SaintExupery/Chapitre_12_3/Documents/Chapitre 12 - Partie 3 - Durées (A trou).docx
@@ -233,7 +233,19 @@
         <w:t>s</w:t>
       </w:r>
       <w:r>
-        <w:t xml:space="preserve"> est 48-17 = 31 secondes.</w:t>
+        <w:t xml:space="preserve"> est 48</w:t>
+      </w:r>
+      <w:r>
+        <w:t xml:space="preserve"> </w:t>
+      </w:r>
+      <w:r>
+        <w:t>-</w:t>
+      </w:r>
+      <w:r>
+        <w:t xml:space="preserve"> </w:t>
+      </w:r>
+      <w:r>
+        <w:t>17 = 31 secondes.</w:t>
       </w:r>
     </w:p>
     <w:p>
@@ -669,7 +681,7 @@
           </w:tcPr>
           <w:p>
             <w:pPr>
-              <w:spacing w:before="240" w:line="480" w:lineRule="auto"/>
+              <w:spacing w:before="240" w:line="360" w:lineRule="auto"/>
               <w:jc w:val="center"/>
             </w:pPr>
             <w:r>
@@ -684,7 +696,7 @@
           </w:p>
           <w:p>
             <w:pPr>
-              <w:spacing w:line="480" w:lineRule="auto"/>
+              <w:spacing w:line="360" w:lineRule="auto"/>
               <w:jc w:val="center"/>
             </w:pPr>
             <w:r>
@@ -699,6 +711,7 @@
           </w:p>
           <w:p>
             <w:pPr>
+              <w:spacing w:line="360" w:lineRule="auto"/>
               <w:jc w:val="center"/>
             </w:pPr>
             <w:r>
@@ -988,6 +1001,272 @@
         </w:tc>
       </w:tr>
     </w:tbl>
+    <w:p>
+      <w:pPr>
+        <w:spacing w:after="0"/>
+      </w:pPr>
+      <w:bookmarkStart w:id="1" w:name="_Hlk240964821"/>
+      <w:r>
+        <w:t>Il existe aussi des cas particuliers :</w:t>
+      </w:r>
+    </w:p>
+    <w:p>
+      <w:pPr>
+        <w:pStyle w:val="Paragraphedeliste"/>
+        <w:numPr>
+          <w:ilvl w:val="0"/>
+          <w:numId w:val="25"/>
+        </w:numPr>
+        <w:tabs>
+          <w:tab w:val="left" w:pos="10206"/>
+        </w:tabs>
+      </w:pPr>
+      <w:r>
+        <w:t xml:space="preserve">Une demi-heure </w:t>
+      </w:r>
+      <w:r>
+        <w:rPr>
+          <w:rFonts w:ascii="Arial" w:eastAsiaTheme="minorHAnsi" w:hAnsi="Arial" w:cs="Arial" w:hint="eastAsia"/>
+          <w:lang w:eastAsia="ja-JP"/>
+        </w:rPr>
+        <w:t>→</w:t>
+      </w:r>
+      <w:r>
+        <w:rPr>
+          <w:rFonts w:ascii="Arial" w:hAnsi="Arial" w:cs="Arial" w:hint="eastAsia"/>
+          <w:lang w:eastAsia="ja-JP"/>
+        </w:rPr>
+        <w:t xml:space="preserve"> </w:t>
+      </w:r>
+      <m:oMath>
+        <m:f>
+          <m:fPr>
+            <m:ctrlPr>
+              <w:rPr>
+                <w:rFonts w:ascii="Cambria Math" w:hAnsi="Cambria Math" w:cs="Arial"/>
+                <w:i/>
+                <w:lang w:eastAsia="ja-JP"/>
+              </w:rPr>
+            </m:ctrlPr>
+          </m:fPr>
+          <m:num>
+            <m:r>
+              <w:rPr>
+                <w:rFonts w:ascii="Cambria Math" w:hAnsi="Cambria Math" w:cs="Arial"/>
+                <w:lang w:eastAsia="ja-JP"/>
+              </w:rPr>
+              <m:t>1</m:t>
+            </m:r>
+          </m:num>
+          <m:den>
+            <m:r>
+              <w:rPr>
+                <w:rFonts w:ascii="Cambria Math" w:hAnsi="Cambria Math" w:cs="Arial"/>
+                <w:lang w:eastAsia="ja-JP"/>
+              </w:rPr>
+              <m:t>2</m:t>
+            </m:r>
+          </m:den>
+        </m:f>
+        <m:r>
+          <w:rPr>
+            <w:rFonts w:ascii="Cambria Math" w:hAnsi="Cambria Math" w:cs="Arial"/>
+            <w:lang w:eastAsia="ja-JP"/>
+          </w:rPr>
+          <m:t xml:space="preserve"> h = </m:t>
+        </m:r>
+        <m:r>
+          <w:rPr>
+            <w:rFonts w:ascii="Cambria Math" w:hAnsi="Cambria Math" w:cs="Arial"/>
+            <w:lang w:eastAsia="ja-JP"/>
+          </w:rPr>
+          <w:tab/>
+        </m:r>
+      </m:oMath>
+      <w:r>
+        <w:rPr>
+          <w:rFonts w:ascii="Arial" w:hAnsi="Arial" w:cs="Arial"/>
+          <w:u w:val="dash"/>
+          <w:lang w:eastAsia="ja-JP"/>
+        </w:rPr>
+        <w:tab/>
+      </w:r>
+    </w:p>
+    <w:p>
+      <w:pPr>
+        <w:pStyle w:val="Paragraphedeliste"/>
+        <w:numPr>
+          <w:ilvl w:val="0"/>
+          <w:numId w:val="25"/>
+        </w:numPr>
+        <w:tabs>
+          <w:tab w:val="left" w:pos="10206"/>
+        </w:tabs>
+      </w:pPr>
+      <w:r>
+        <w:t xml:space="preserve">Un quart d’heure </w:t>
+      </w:r>
+      <w:r>
+        <w:rPr>
+          <w:rFonts w:ascii="Arial" w:hAnsi="Arial" w:cs="Arial" w:hint="eastAsia"/>
+          <w:lang w:eastAsia="ja-JP"/>
+        </w:rPr>
+        <w:t>→</w:t>
+      </w:r>
+      <w:r>
+        <w:rPr>
+          <w:rFonts w:ascii="Arial" w:hAnsi="Arial" w:cs="Arial" w:hint="eastAsia"/>
+          <w:lang w:eastAsia="ja-JP"/>
+        </w:rPr>
+        <w:t xml:space="preserve"> </w:t>
+      </w:r>
+      <m:oMath>
+        <m:f>
+          <m:fPr>
+            <m:ctrlPr>
+              <w:rPr>
+                <w:rFonts w:ascii="Cambria Math" w:hAnsi="Cambria Math" w:cs="Arial"/>
+                <w:i/>
+                <w:lang w:eastAsia="ja-JP"/>
+              </w:rPr>
+            </m:ctrlPr>
+          </m:fPr>
+          <m:num>
+            <m:r>
+              <w:rPr>
+                <w:rFonts w:ascii="Cambria Math" w:hAnsi="Cambria Math" w:cs="Arial"/>
+                <w:lang w:eastAsia="ja-JP"/>
+              </w:rPr>
+              <m:t>1</m:t>
+            </m:r>
+          </m:num>
+          <m:den>
+            <m:r>
+              <w:rPr>
+                <w:rFonts w:ascii="Cambria Math" w:hAnsi="Cambria Math" w:cs="Arial"/>
+                <w:lang w:eastAsia="ja-JP"/>
+              </w:rPr>
+              <m:t>4</m:t>
+            </m:r>
+          </m:den>
+        </m:f>
+        <m:r>
+          <w:rPr>
+            <w:rFonts w:ascii="Cambria Math" w:hAnsi="Cambria Math" w:cs="Arial"/>
+            <w:lang w:eastAsia="ja-JP"/>
+          </w:rPr>
+          <m:t xml:space="preserve"> h=</m:t>
+        </m:r>
+        <m:r>
+          <w:rPr>
+            <w:rFonts w:ascii="Cambria Math" w:hAnsi="Cambria Math" w:cs="Arial"/>
+            <w:lang w:eastAsia="ja-JP"/>
+          </w:rPr>
+          <w:tab/>
+        </m:r>
+      </m:oMath>
+      <w:r>
+        <w:rPr>
+          <w:rFonts w:ascii="Arial" w:hAnsi="Arial" w:cs="Arial"/>
+          <w:u w:val="dash"/>
+          <w:lang w:eastAsia="ja-JP"/>
+        </w:rPr>
+        <w:tab/>
+      </w:r>
+    </w:p>
+    <w:p>
+      <w:pPr>
+        <w:pStyle w:val="Paragraphedeliste"/>
+        <w:numPr>
+          <w:ilvl w:val="0"/>
+          <w:numId w:val="25"/>
+        </w:numPr>
+        <w:tabs>
+          <w:tab w:val="left" w:pos="10206"/>
+        </w:tabs>
+        <w:spacing w:after="0"/>
+      </w:pPr>
+      <w:r>
+        <w:t>Trois</w:t>
+      </w:r>
+      <w:r>
+        <w:t xml:space="preserve"> quart</w:t>
+      </w:r>
+      <w:r>
+        <w:t>s</w:t>
+      </w:r>
+      <w:r>
+        <w:t xml:space="preserve"> d’heure </w:t>
+      </w:r>
+      <w:r>
+        <w:rPr>
+          <w:rFonts w:ascii="Arial" w:hAnsi="Arial" w:cs="Arial" w:hint="eastAsia"/>
+          <w:lang w:eastAsia="ja-JP"/>
+        </w:rPr>
+        <w:t>→</w:t>
+      </w:r>
+      <w:r>
+        <w:rPr>
+          <w:rFonts w:ascii="Arial" w:hAnsi="Arial" w:cs="Arial" w:hint="eastAsia"/>
+          <w:lang w:eastAsia="ja-JP"/>
+        </w:rPr>
+        <w:t xml:space="preserve"> </w:t>
+      </w:r>
+      <m:oMath>
+        <m:f>
+          <m:fPr>
+            <m:ctrlPr>
+              <w:rPr>
+                <w:rFonts w:ascii="Cambria Math" w:hAnsi="Cambria Math" w:cs="Arial"/>
+                <w:i/>
+                <w:lang w:eastAsia="ja-JP"/>
+              </w:rPr>
+            </m:ctrlPr>
+          </m:fPr>
+          <m:num>
+            <m:r>
+              <w:rPr>
+                <w:rFonts w:ascii="Cambria Math" w:hAnsi="Cambria Math" w:cs="Arial"/>
+                <w:lang w:eastAsia="ja-JP"/>
+              </w:rPr>
+              <m:t>3</m:t>
+            </m:r>
+          </m:num>
+          <m:den>
+            <m:r>
+              <w:rPr>
+                <w:rFonts w:ascii="Cambria Math" w:hAnsi="Cambria Math" w:cs="Arial"/>
+                <w:lang w:eastAsia="ja-JP"/>
+              </w:rPr>
+              <m:t>4</m:t>
+            </m:r>
+          </m:den>
+        </m:f>
+        <m:r>
+          <w:rPr>
+            <w:rFonts w:ascii="Cambria Math" w:hAnsi="Cambria Math" w:cs="Arial"/>
+            <w:lang w:eastAsia="ja-JP"/>
+          </w:rPr>
+          <m:t xml:space="preserve"> h=</m:t>
+        </m:r>
+        <m:r>
+          <w:rPr>
+            <w:rFonts w:ascii="Cambria Math" w:hAnsi="Cambria Math" w:cs="Arial"/>
+            <w:lang w:eastAsia="ja-JP"/>
+          </w:rPr>
+          <w:tab/>
+        </m:r>
+      </m:oMath>
+      <w:r>
+        <w:rPr>
+          <w:rFonts w:ascii="Arial" w:hAnsi="Arial" w:cs="Arial"/>
+          <w:u w:val="dash"/>
+          <w:lang w:eastAsia="ja-JP"/>
+        </w:rPr>
+        <w:tab/>
+      </w:r>
+    </w:p>
+    <w:bookmarkEnd w:id="1"/>
     <w:p>
       <w:pPr>
         <w:pStyle w:val="Titre1"/>
@@ -1185,6 +1464,7 @@
           <w:rFonts w:eastAsia="Times New Roman" w:cstheme="minorHAnsi"/>
           <w:lang w:eastAsia="fr-FR"/>
         </w:rPr>
+        <w:lastRenderedPageBreak/>
         <w:t>On regarde le temps nécessaire pour aller à l'heure suivante :</w:t>
       </w:r>
       <w:r>
@@ -1221,7 +1501,6 @@
           <w:rFonts w:eastAsia="Times New Roman" w:cstheme="minorHAnsi"/>
           <w:lang w:eastAsia="fr-FR"/>
         </w:rPr>
-        <w:lastRenderedPageBreak/>
         <w:t>On calcul ensuite le temps restant pour atteindre le temps final :</w:t>
       </w:r>
       <w:r>
@@ -3046,8 +3325,8 @@
     <w:pPr>
       <w:pStyle w:val="En-tte"/>
       <w:rPr>
-        <w:sz w:val="36"/>
-        <w:szCs w:val="36"/>
+        <w:sz w:val="12"/>
+        <w:szCs w:val="12"/>
       </w:rPr>
     </w:pPr>
   </w:p>
@@ -3367,6 +3646,119 @@
     </w:lvl>
   </w:abstractNum>
   <w:abstractNum w:abstractNumId="1" w15:restartNumberingAfterBreak="0">
+    <w:nsid w:val="052F7E4A"/>
+    <w:multiLevelType w:val="hybridMultilevel"/>
+    <w:tmpl w:val="3B5A3F2E"/>
+    <w:lvl w:ilvl="0" w:tplc="1D3A9F5C">
+      <w:start w:val="1"/>
+      <w:numFmt w:val="bullet"/>
+      <w:lvlText w:val="-"/>
+      <w:lvlJc w:val="left"/>
+      <w:pPr>
+        <w:ind w:left="720" w:hanging="360"/>
+      </w:pPr>
+      <w:rPr>
+        <w:rFonts w:ascii="Verdana" w:eastAsiaTheme="minorHAnsi" w:hAnsi="Verdana" w:cstheme="minorBidi" w:hint="default"/>
+      </w:rPr>
+    </w:lvl>
+    <w:lvl w:ilvl="1" w:tplc="040C0003" w:tentative="1">
+      <w:start w:val="1"/>
+      <w:numFmt w:val="bullet"/>
+      <w:lvlText w:val="o"/>
+      <w:lvlJc w:val="left"/>
+      <w:pPr>
+        <w:ind w:left="1440" w:hanging="360"/>
+      </w:pPr>
+      <w:rPr>
+        <w:rFonts w:ascii="Courier New" w:hAnsi="Courier New" w:cs="Courier New" w:hint="default"/>
+      </w:rPr>
+    </w:lvl>
+    <w:lvl w:ilvl="2" w:tplc="040C0005" w:tentative="1">
+      <w:start w:val="1"/>
+      <w:numFmt w:val="bullet"/>
+      <w:lvlText w:val=""/>
+      <w:lvlJc w:val="left"/>
+      <w:pPr>
+        <w:ind w:left="2160" w:hanging="360"/>
+      </w:pPr>
+      <w:rPr>
+        <w:rFonts w:ascii="Wingdings" w:hAnsi="Wingdings" w:hint="default"/>
+      </w:rPr>
+    </w:lvl>
+    <w:lvl w:ilvl="3" w:tplc="040C0001" w:tentative="1">
+      <w:start w:val="1"/>
+      <w:numFmt w:val="bullet"/>
+      <w:lvlText w:val=""/>
+      <w:lvlJc w:val="left"/>
+      <w:pPr>
+        <w:ind w:left="2880" w:hanging="360"/>
+      </w:pPr>
+      <w:rPr>
+        <w:rFonts w:ascii="Symbol" w:hAnsi="Symbol" w:hint="default"/>
+      </w:rPr>
+    </w:lvl>
+    <w:lvl w:ilvl="4" w:tplc="040C0003" w:tentative="1">
+      <w:start w:val="1"/>
+      <w:numFmt w:val="bullet"/>
+      <w:lvlText w:val="o"/>
+      <w:lvlJc w:val="left"/>
+      <w:pPr>
+        <w:ind w:left="3600" w:hanging="360"/>
+      </w:pPr>
+      <w:rPr>
+        <w:rFonts w:ascii="Courier New" w:hAnsi="Courier New" w:cs="Courier New" w:hint="default"/>
+      </w:rPr>
+    </w:lvl>
+    <w:lvl w:ilvl="5" w:tplc="040C0005" w:tentative="1">
+      <w:start w:val="1"/>
+      <w:numFmt w:val="bullet"/>
+      <w:lvlText w:val=""/>
+      <w:lvlJc w:val="left"/>
+      <w:pPr>
+        <w:ind w:left="4320" w:hanging="360"/>
+      </w:pPr>
+      <w:rPr>
+        <w:rFonts w:ascii="Wingdings" w:hAnsi="Wingdings" w:hint="default"/>
+      </w:rPr>
+    </w:lvl>
+    <w:lvl w:ilvl="6" w:tplc="040C0001" w:tentative="1">
+      <w:start w:val="1"/>
+      <w:numFmt w:val="bullet"/>
+      <w:lvlText w:val=""/>
+      <w:lvlJc w:val="left"/>
+      <w:pPr>
+        <w:ind w:left="5040" w:hanging="360"/>
+      </w:pPr>
+      <w:rPr>
+        <w:rFonts w:ascii="Symbol" w:hAnsi="Symbol" w:hint="default"/>
+      </w:rPr>
+    </w:lvl>
+    <w:lvl w:ilvl="7" w:tplc="040C0003" w:tentative="1">
+      <w:start w:val="1"/>
+      <w:numFmt w:val="bullet"/>
+      <w:lvlText w:val="o"/>
+      <w:lvlJc w:val="left"/>
+      <w:pPr>
+        <w:ind w:left="5760" w:hanging="360"/>
+      </w:pPr>
+      <w:rPr>
+        <w:rFonts w:ascii="Courier New" w:hAnsi="Courier New" w:cs="Courier New" w:hint="default"/>
+      </w:rPr>
+    </w:lvl>
+    <w:lvl w:ilvl="8" w:tplc="040C0005" w:tentative="1">
+      <w:start w:val="1"/>
+      <w:numFmt w:val="bullet"/>
+      <w:lvlText w:val=""/>
+      <w:lvlJc w:val="left"/>
+      <w:pPr>
+        <w:ind w:left="6480" w:hanging="360"/>
+      </w:pPr>
+      <w:rPr>
+        <w:rFonts w:ascii="Wingdings" w:hAnsi="Wingdings" w:hint="default"/>
+      </w:rPr>
+    </w:lvl>
+  </w:abstractNum>
+  <w:abstractNum w:abstractNumId="2" w15:restartNumberingAfterBreak="0">
     <w:nsid w:val="05676BEF"/>
     <w:multiLevelType w:val="multilevel"/>
     <w:tmpl w:val="22B032F2"/>
@@ -3515,7 +3907,7 @@
       </w:rPr>
     </w:lvl>
   </w:abstractNum>
-  <w:abstractNum w:abstractNumId="2" w15:restartNumberingAfterBreak="0">
+  <w:abstractNum w:abstractNumId="3" w15:restartNumberingAfterBreak="0">
     <w:nsid w:val="15B1693D"/>
     <w:multiLevelType w:val="hybridMultilevel"/>
     <w:tmpl w:val="6576BF66"/>
@@ -3628,7 +4020,7 @@
       </w:rPr>
     </w:lvl>
   </w:abstractNum>
-  <w:abstractNum w:abstractNumId="3" w15:restartNumberingAfterBreak="0">
+  <w:abstractNum w:abstractNumId="4" w15:restartNumberingAfterBreak="0">
     <w:nsid w:val="18715A17"/>
     <w:multiLevelType w:val="multilevel"/>
     <w:tmpl w:val="D77C3ED2"/>
@@ -3777,7 +4169,7 @@
       </w:rPr>
     </w:lvl>
   </w:abstractNum>
-  <w:abstractNum w:abstractNumId="4" w15:restartNumberingAfterBreak="0">
+  <w:abstractNum w:abstractNumId="5" w15:restartNumberingAfterBreak="0">
     <w:nsid w:val="259F0E89"/>
     <w:multiLevelType w:val="multilevel"/>
     <w:tmpl w:val="940E7980"/>
@@ -3926,7 +4318,7 @@
       </w:rPr>
     </w:lvl>
   </w:abstractNum>
-  <w:abstractNum w:abstractNumId="5" w15:restartNumberingAfterBreak="0">
+  <w:abstractNum w:abstractNumId="6" w15:restartNumberingAfterBreak="0">
     <w:nsid w:val="27617B82"/>
     <w:multiLevelType w:val="hybridMultilevel"/>
     <w:tmpl w:val="D4DA2D3A"/>
@@ -4041,7 +4433,7 @@
       </w:rPr>
     </w:lvl>
   </w:abstractNum>
-  <w:abstractNum w:abstractNumId="6" w15:restartNumberingAfterBreak="0">
+  <w:abstractNum w:abstractNumId="7" w15:restartNumberingAfterBreak="0">
     <w:nsid w:val="3566419A"/>
     <w:multiLevelType w:val="hybridMultilevel"/>
     <w:tmpl w:val="FA760E2C"/>
@@ -4155,7 +4547,7 @@
       </w:rPr>
     </w:lvl>
   </w:abstractNum>
-  <w:abstractNum w:abstractNumId="7" w15:restartNumberingAfterBreak="0">
+  <w:abstractNum w:abstractNumId="8" w15:restartNumberingAfterBreak="0">
     <w:nsid w:val="45FE6B5F"/>
     <w:multiLevelType w:val="hybridMultilevel"/>
     <w:tmpl w:val="5010F51E"/>
@@ -4244,7 +4636,7 @@
       </w:pPr>
     </w:lvl>
   </w:abstractNum>
-  <w:abstractNum w:abstractNumId="8" w15:restartNumberingAfterBreak="0">
+  <w:abstractNum w:abstractNumId="9" w15:restartNumberingAfterBreak="0">
     <w:nsid w:val="50E9500A"/>
     <w:multiLevelType w:val="hybridMultilevel"/>
     <w:tmpl w:val="D4988D3C"/>
@@ -4334,7 +4726,7 @@
       </w:pPr>
     </w:lvl>
   </w:abstractNum>
-  <w:abstractNum w:abstractNumId="9" w15:restartNumberingAfterBreak="0">
+  <w:abstractNum w:abstractNumId="10" w15:restartNumberingAfterBreak="0">
     <w:nsid w:val="5920710F"/>
     <w:multiLevelType w:val="hybridMultilevel"/>
     <w:tmpl w:val="95C679B8"/>
@@ -4423,7 +4815,7 @@
       </w:pPr>
     </w:lvl>
   </w:abstractNum>
-  <w:abstractNum w:abstractNumId="10" w15:restartNumberingAfterBreak="0">
+  <w:abstractNum w:abstractNumId="11" w15:restartNumberingAfterBreak="0">
     <w:nsid w:val="59C47556"/>
     <w:multiLevelType w:val="multilevel"/>
     <w:tmpl w:val="798A3514"/>
@@ -4544,7 +4936,7 @@
       </w:pPr>
     </w:lvl>
   </w:abstractNum>
-  <w:abstractNum w:abstractNumId="11" w15:restartNumberingAfterBreak="0">
+  <w:abstractNum w:abstractNumId="12" w15:restartNumberingAfterBreak="0">
     <w:nsid w:val="5EB74A7E"/>
     <w:multiLevelType w:val="hybridMultilevel"/>
     <w:tmpl w:val="0BD07006"/>
@@ -4657,7 +5049,7 @@
       </w:rPr>
     </w:lvl>
   </w:abstractNum>
-  <w:abstractNum w:abstractNumId="12" w15:restartNumberingAfterBreak="0">
+  <w:abstractNum w:abstractNumId="13" w15:restartNumberingAfterBreak="0">
     <w:nsid w:val="5F894C04"/>
     <w:multiLevelType w:val="hybridMultilevel"/>
     <w:tmpl w:val="495A510E"/>
@@ -4769,7 +5161,7 @@
       </w:rPr>
     </w:lvl>
   </w:abstractNum>
-  <w:abstractNum w:abstractNumId="13" w15:restartNumberingAfterBreak="0">
+  <w:abstractNum w:abstractNumId="14" w15:restartNumberingAfterBreak="0">
     <w:nsid w:val="65246909"/>
     <w:multiLevelType w:val="hybridMultilevel"/>
     <w:tmpl w:val="BB008CB2"/>
@@ -4882,7 +5274,7 @@
       </w:rPr>
     </w:lvl>
   </w:abstractNum>
-  <w:abstractNum w:abstractNumId="14" w15:restartNumberingAfterBreak="0">
+  <w:abstractNum w:abstractNumId="15" w15:restartNumberingAfterBreak="0">
     <w:nsid w:val="759C3FFB"/>
     <w:multiLevelType w:val="hybridMultilevel"/>
     <w:tmpl w:val="71309954"/>
@@ -4995,7 +5387,7 @@
       </w:rPr>
     </w:lvl>
   </w:abstractNum>
-  <w:abstractNum w:abstractNumId="15" w15:restartNumberingAfterBreak="0">
+  <w:abstractNum w:abstractNumId="16" w15:restartNumberingAfterBreak="0">
     <w:nsid w:val="76487A28"/>
     <w:multiLevelType w:val="hybridMultilevel"/>
     <w:tmpl w:val="601ECE0C"/>
@@ -5087,97 +5479,100 @@
     </w:lvl>
   </w:abstractNum>
   <w:num w:numId="1" w16cid:durableId="427965013">
-    <w:abstractNumId w:val="8"/>
+    <w:abstractNumId w:val="9"/>
   </w:num>
   <w:num w:numId="2" w16cid:durableId="750197462">
-    <w:abstractNumId w:val="8"/>
+    <w:abstractNumId w:val="9"/>
     <w:lvlOverride w:ilvl="0">
       <w:startOverride w:val="1"/>
     </w:lvlOverride>
   </w:num>
   <w:num w:numId="3" w16cid:durableId="425661314">
-    <w:abstractNumId w:val="7"/>
+    <w:abstractNumId w:val="8"/>
   </w:num>
   <w:num w:numId="4" w16cid:durableId="267591353">
-    <w:abstractNumId w:val="9"/>
+    <w:abstractNumId w:val="10"/>
   </w:num>
   <w:num w:numId="5" w16cid:durableId="184222371">
-    <w:abstractNumId w:val="6"/>
+    <w:abstractNumId w:val="7"/>
   </w:num>
   <w:num w:numId="6" w16cid:durableId="208107064">
     <w:abstractNumId w:val="0"/>
   </w:num>
   <w:num w:numId="7" w16cid:durableId="1379402123">
-    <w:abstractNumId w:val="15"/>
+    <w:abstractNumId w:val="16"/>
   </w:num>
   <w:num w:numId="8" w16cid:durableId="1994408194">
-    <w:abstractNumId w:val="5"/>
+    <w:abstractNumId w:val="6"/>
   </w:num>
   <w:num w:numId="9" w16cid:durableId="590623789">
-    <w:abstractNumId w:val="2"/>
+    <w:abstractNumId w:val="3"/>
   </w:num>
   <w:num w:numId="10" w16cid:durableId="229772194">
-    <w:abstractNumId w:val="11"/>
+    <w:abstractNumId w:val="12"/>
   </w:num>
   <w:num w:numId="11" w16cid:durableId="628974402">
-    <w:abstractNumId w:val="8"/>
+    <w:abstractNumId w:val="9"/>
     <w:lvlOverride w:ilvl="0">
       <w:startOverride w:val="1"/>
     </w:lvlOverride>
   </w:num>
   <w:num w:numId="12" w16cid:durableId="326330227">
-    <w:abstractNumId w:val="8"/>
+    <w:abstractNumId w:val="9"/>
     <w:lvlOverride w:ilvl="0">
       <w:startOverride w:val="1"/>
     </w:lvlOverride>
   </w:num>
   <w:num w:numId="13" w16cid:durableId="2082021097">
-    <w:abstractNumId w:val="3"/>
+    <w:abstractNumId w:val="4"/>
   </w:num>
   <w:num w:numId="14" w16cid:durableId="1262032751">
-    <w:abstractNumId w:val="14"/>
+    <w:abstractNumId w:val="15"/>
   </w:num>
   <w:num w:numId="15" w16cid:durableId="1186216242">
-    <w:abstractNumId w:val="8"/>
+    <w:abstractNumId w:val="9"/>
   </w:num>
   <w:num w:numId="16" w16cid:durableId="1038747201">
-    <w:abstractNumId w:val="8"/>
+    <w:abstractNumId w:val="9"/>
     <w:lvlOverride w:ilvl="0">
       <w:startOverride w:val="1"/>
     </w:lvlOverride>
   </w:num>
   <w:num w:numId="17" w16cid:durableId="27876708">
-    <w:abstractNumId w:val="8"/>
+    <w:abstractNumId w:val="9"/>
     <w:lvlOverride w:ilvl="0">
       <w:startOverride w:val="1"/>
     </w:lvlOverride>
   </w:num>
   <w:num w:numId="18" w16cid:durableId="1151799149">
-    <w:abstractNumId w:val="4"/>
+    <w:abstractNumId w:val="5"/>
   </w:num>
   <w:num w:numId="19" w16cid:durableId="690497502">
-    <w:abstractNumId w:val="1"/>
+    <w:abstractNumId w:val="2"/>
   </w:num>
   <w:num w:numId="20" w16cid:durableId="1376007929">
-    <w:abstractNumId w:val="10"/>
+    <w:abstractNumId w:val="11"/>
   </w:num>
   <w:num w:numId="21" w16cid:durableId="916982687">
-    <w:abstractNumId w:val="8"/>
+    <w:abstractNumId w:val="9"/>
     <w:lvlOverride w:ilvl="0">
       <w:startOverride w:val="1"/>
     </w:lvlOverride>
   </w:num>
   <w:num w:numId="22" w16cid:durableId="836188976">
-    <w:abstractNumId w:val="8"/>
+    <w:abstractNumId w:val="9"/>
     <w:lvlOverride w:ilvl="0">
       <w:startOverride w:val="1"/>
     </w:lvlOverride>
   </w:num>
   <w:num w:numId="23" w16cid:durableId="374699199">
-    <w:abstractNumId w:val="12"/>
+    <w:abstractNumId w:val="13"/>
   </w:num>
   <w:num w:numId="24" w16cid:durableId="595485869">
-    <w:abstractNumId w:val="13"/>
+    <w:abstractNumId w:val="14"/>
+  </w:num>
+  <w:num w:numId="25" w16cid:durableId="402947570">
+    <w:abstractNumId w:val="1"/>
   </w:num>
   <w:numIdMacAtCleanup w:val="5"/>
 </w:numbering>
@@ -5188,7 +5583,7 @@
   <w:docDefaults>
     <w:rPrDefault>
       <w:rPr>
-        <w:rFonts w:asciiTheme="minorHAnsi" w:eastAsiaTheme="minorHAnsi" w:hAnsiTheme="minorHAnsi" w:cstheme="minorBidi"/>
+        <w:rFonts w:asciiTheme="minorHAnsi" w:eastAsia="MS Mincho" w:hAnsiTheme="minorHAnsi" w:cstheme="minorBidi"/>
         <w:sz w:val="22"/>
         <w:szCs w:val="22"/>
         <w:lang w:val="fr-FR" w:eastAsia="en-US" w:bidi="ar-SA"/>

</xml_diff>